<commit_message>
Correct CatalogONE study: CRM publish is generic; Dynamics is CEP
The deck had mixed CatalogONE's unnamed "customer's CRM" publish with
CEP putting Catalog next to Dynamics 365. Split those facts. Add PLDT
as live CEP customer-care evidence (IDC Unified Case Management), not
as a CatalogONE-to-Dynamics catalog connector.

Co-authored-by: abdelrahman Hamdy <abdoe317111@gmail.com>
</commit_message>
<xml_diff>
--- a/plc_study/PLC_CatalogONE_Study.docx
+++ b/plc_study/PLC_CatalogONE_Study.docx
@@ -20,7 +20,7 @@
         </w:rPr>
         <w:t>Product Lifecycle Management in Amdocs CatalogONE:</w:t>
         <w:br/>
-        <w:t>from Idea to Dynamics 365</w:t>
+        <w:t>from Idea to CRM</w:t>
       </w:r>
     </w:p>
     <w:p>
@@ -29,7 +29,7 @@
           <w:i w:val="0"/>
           <w:color w:val="5F5A6B"/>
         </w:rPr>
-        <w:t>System studied: Amdocs CatalogONE, a standalone telecom product catalog and Product Lifecycle Management (PLM) platform. It is BSS-agnostic: it owns the catalog, not the CRM. The documented publish path into Microsoft Dynamics 365 is the Amdocs–Microsoft Customer Engagement Platform.</w:t>
+        <w:t>System studied: Amdocs CatalogONE, a standalone telecom product catalog and Product Lifecycle Management (PLM) platform. It is BSS-agnostic: it owns the catalog, not the CRM. Amdocs documents that CatalogONE publishes to consuming applications and to "the customer's CRM". The Amdocs–Microsoft Customer Engagement Platform is the product that puts an Amdocs Catalog next to Dynamics 365. Amdocs does not publish a CatalogONE-branded connector named Dynamics 365.</w:t>
       </w:r>
     </w:p>
     <w:p>
@@ -38,7 +38,7 @@
           <w:i w:val="0"/>
           <w:color w:val="5F5A6B"/>
         </w:rPr>
-        <w:t>Prepared by: [Your name]    |    Version: Draft 1 for review    |    October 2026</w:t>
+        <w:t>Prepared by: [Your name]    |    Version: Draft 3 for review    |    October 2026</w:t>
       </w:r>
     </w:p>
     <w:tbl>
@@ -68,7 +68,7 @@
               <w:rPr>
                 <w:sz w:val="20"/>
               </w:rPr>
-              <w:t>Every statement is tagged: [A] = Amdocs public datasheets, whitepapers or the Amdocs–Microsoft Customer Engagement Platform; [P] = Appledore Research solution profile of CatalogONE (2020); [T] = TM Forum case study or Open API conformance list; [S] = TM Forum TMF620 and related Open APIs; [M] = Microsoft documentation; [E] = illustrative example. CatalogONE user guides are not public, so screen names in the walkthroughs are illustrative and will differ in a real installation.</w:t>
+              <w:t>Every statement is tagged: [A] = Amdocs public datasheets, whitepapers or the Amdocs–Microsoft Customer Engagement Platform; [P] = Appledore Research solution profile of CatalogONE (2020); [T] = TM Forum case study or Open API conformance list; [S] = TM Forum TMF620 and related Open APIs; [M] = Microsoft documentation; [I] = IDC customer case study on PLDT Unified Case Management (hosted by Amdocs, June 2026); [E] = illustrative example. CatalogONE user guides are not public, so screen names in the walkthroughs are illustrative and will differ in a real installation.</w:t>
             </w:r>
           </w:p>
         </w:tc>
@@ -91,10 +91,10 @@
         <w:rPr>
           <w:b/>
         </w:rPr>
-        <w:t xml:space="preserve">Catalog only, CRM stays Dynamics. </w:t>
+        <w:t xml:space="preserve">Catalog only, not a CRM. </w:t>
       </w:r>
       <w:r>
-        <w:t>CatalogONE is a product catalog and PLM. It is not a CRM. Microsoft Dynamics 365 remains the sales, quote and order front end. Amdocs and Microsoft already sell this split as one platform [A].</w:t>
+        <w:t>CatalogONE is a product catalog and PLM. It is not a CRM. It publishes approved catalog data to consuming applications; Amdocs names "the customer's CRM" as one of those consumers [A].</w:t>
       </w:r>
     </w:p>
     <w:p>
@@ -150,7 +150,7 @@
         <w:t xml:space="preserve">Publish, do not re-key. </w:t>
       </w:r>
       <w:r>
-        <w:t>CatalogONE Centralized authors once and publishes catalog information to consuming applications. Distribution uses a Kafka bus and TMF APIs, in minutes rather than weeks [A][P].</w:t>
+        <w:t>CatalogONE Centralized authors once and publishes catalog information to consuming applications. Distribution uses a Kafka bus and TMF APIs, in minutes rather than weeks [A][P]. Dynamics 365 is not named on the CatalogONE datasheet; it is named on the Amdocs–Microsoft CEP [A].</w:t>
       </w:r>
     </w:p>
     <w:p>
@@ -647,7 +647,7 @@
         <w:rPr>
           <w:i/>
         </w:rPr>
-        <w:t>CatalogONE is built on the TM Forum data model and exposes TMF Open APIs. Amdocs is listed on the TM Forum Open API conformance register for TMF620 (Product Catalog Management) and related commerce APIs. CatalogONE PLM is described as covering ideation through end-of-life, so the stages below follow the industry model rather than a vendor-only one [A][T][S]. This document covers everything up to Launched: the stages before CRM, and the hand-over to Dynamics 365.</w:t>
+        <w:t>CatalogONE is built on the TM Forum data model and exposes TMF Open APIs. Amdocs is listed on the TM Forum Open API conformance register for TMF620 (Product Catalog Management) and related commerce APIs. CatalogONE PLM is described as covering ideation through end-of-life, so the stages below follow the industry model rather than a vendor-only one [A][T][S]. This document covers everything up to Launched: the stages before CRM, how CatalogONE publishes to consuming systems, and how that relates to Dynamics 365 in the Amdocs–Microsoft platform.</w:t>
       </w:r>
     </w:p>
     <w:p>
@@ -3816,7 +3816,7 @@
               <w:rPr>
                 <w:sz w:val="19"/>
               </w:rPr>
-              <w:t>Rules defined, so Dynamics / CPQ will only offer the product to eligible customers.</w:t>
+              <w:t>Rules defined, so the sales channel / CPQ will only offer the product to eligible customers.</w:t>
             </w:r>
           </w:p>
         </w:tc>
@@ -4905,7 +4905,7 @@
               <w:rPr>
                 <w:sz w:val="19"/>
               </w:rPr>
-              <w:t>Status Active: validated and ready to hand over to Dynamics 365.</w:t>
+              <w:t>Status Active: validated and ready to publish to consuming applications.</w:t>
             </w:r>
           </w:p>
         </w:tc>
@@ -4981,7 +4981,7 @@
         <w:t xml:space="preserve">4.  </w:t>
       </w:r>
       <w:r>
-        <w:t>If tests pass, the product moves to Active, ready to be published to Dynamics.</w:t>
+        <w:t>If tests pass, the product moves to Active, ready to be published to consuming applications (CRM, CPQ, ordering) [A].</w:t>
       </w:r>
     </w:p>
     <w:p>
@@ -6028,15 +6028,49 @@
         <w:pStyle w:val="Heading1"/>
       </w:pPr>
       <w:r>
-        <w:t>4. Integration with Dynamics 365: how CatalogONE hands the product over</w:t>
+        <w:t>4. How the catalog reaches CRM — and what Amdocs actually documents</w:t>
       </w:r>
     </w:p>
+    <w:tbl>
+      <w:tblPr>
+        <w:tblStyle w:val="TableGrid"/>
+        <w:tblW w:type="auto" w:w="0"/>
+        <w:tblLook w:firstColumn="1" w:firstRow="1" w:lastColumn="0" w:lastRow="0" w:noHBand="0" w:noVBand="1" w:val="04A0"/>
+      </w:tblPr>
+      <w:tblGrid>
+        <w:gridCol w:w="9746"/>
+      </w:tblGrid>
+      <w:tr>
+        <w:tc>
+          <w:tcPr>
+            <w:tcW w:type="dxa" w:w="9746"/>
+            <w:shd w:val="clear" w:color="auto" w:fill="E8F0F8"/>
+          </w:tcPr>
+          <w:p>
+            <w:r>
+              <w:rPr>
+                <w:b/>
+                <w:color w:val="0C294B"/>
+              </w:rPr>
+              <w:t xml:space="preserve">Read this section first.  </w:t>
+            </w:r>
+            <w:r>
+              <w:rPr>
+                <w:sz w:val="20"/>
+              </w:rPr>
+              <w:t>Two facts are documented, and they are not the same sentence. (1) CatalogONE publishes catalog data to consuming applications and to "the customer's CRM" [A]. (2) The Amdocs–Microsoft Customer Engagement Platform puts an Amdocs unified Catalog next to Dynamics 365 Sales [A]. Amdocs does not publish a sentence that says "CatalogONE sends data to Microsoft Dynamics 365 CRM". The mapping table later in this section is an example [E], not a vendor connector spec.</w:t>
+            </w:r>
+          </w:p>
+        </w:tc>
+      </w:tr>
+    </w:tbl>
+    <w:p/>
     <w:p>
       <w:pPr>
         <w:pStyle w:val="Heading2"/>
       </w:pPr>
       <w:r>
-        <w:t>4.1 The principle: Dynamics consumes, it does not re-create</w:t>
+        <w:t>4.1 What CatalogONE documents: publish to consuming systems, including CRM</w:t>
       </w:r>
     </w:p>
     <w:p>
@@ -6044,7 +6078,7 @@
         <w:rPr>
           <w:i w:val="0"/>
         </w:rPr>
-        <w:t>In this pattern the catalog is the single source of truth. Dynamics 365 Sales does not become the place where products are invented. Product managers finish the lifecycle in CatalogONE; Dynamics receives the approved, sellable definition and uses it on quotes, orders and contracts.</w:t>
+        <w:t>CatalogONE Centralized "enables centralized authoring … publishing catalog information to multiple consuming applications" [A]. The CatalogONE brochure describes "integration to Amdocs CPQ and the customer's CRM solution" [A]. It does not name Microsoft Dynamics 365 on that page.</w:t>
       </w:r>
     </w:p>
     <w:p>
@@ -6052,15 +6086,315 @@
         <w:rPr>
           <w:i w:val="0"/>
         </w:rPr>
-        <w:t>That split is not a custom idea. Amdocs and Microsoft already productise it as the Customer Engagement Platform: Amdocs supplies Catalog, CPQ, Commerce and Order Management; Microsoft supplies Dynamics 365 Sales, Marketing and Customer Service, plus Power Platform [A].</w:t>
+        <w:t>How that publish is done, as documented for CatalogONE [A][P][T][S]:</w:t>
       </w:r>
     </w:p>
+    <w:tbl>
+      <w:tblPr>
+        <w:tblStyle w:val="TableGrid"/>
+        <w:tblW w:type="auto" w:w="0"/>
+        <w:jc w:val="center"/>
+        <w:tblLayout w:type="fixed"/>
+        <w:tblLook w:firstColumn="1" w:firstRow="1" w:lastColumn="0" w:lastRow="0" w:noHBand="0" w:noVBand="1" w:val="04A0"/>
+      </w:tblPr>
+      <w:tblGrid>
+        <w:gridCol w:w="2494"/>
+        <w:gridCol w:w="4195"/>
+        <w:gridCol w:w="2721"/>
+      </w:tblGrid>
+      <w:tr>
+        <w:tc>
+          <w:tcPr>
+            <w:tcW w:type="dxa" w:w="2494"/>
+            <w:shd w:val="clear" w:color="auto" w:fill="0C294B"/>
+          </w:tcPr>
+          <w:p>
+            <w:pPr>
+              <w:keepNext/>
+            </w:pPr>
+            <w:r/>
+            <w:r>
+              <w:rPr>
+                <w:b/>
+                <w:color w:val="FFFFFF"/>
+                <w:sz w:val="19"/>
+              </w:rPr>
+              <w:t>Mechanism</w:t>
+            </w:r>
+          </w:p>
+        </w:tc>
+        <w:tc>
+          <w:tcPr>
+            <w:tcW w:type="dxa" w:w="4195"/>
+            <w:shd w:val="clear" w:color="auto" w:fill="0C294B"/>
+          </w:tcPr>
+          <w:p>
+            <w:pPr>
+              <w:keepNext/>
+            </w:pPr>
+            <w:r/>
+            <w:r>
+              <w:rPr>
+                <w:b/>
+                <w:color w:val="FFFFFF"/>
+                <w:sz w:val="19"/>
+              </w:rPr>
+              <w:t>What Amdocs / TM Forum say</w:t>
+            </w:r>
+          </w:p>
+        </w:tc>
+        <w:tc>
+          <w:tcPr>
+            <w:tcW w:type="dxa" w:w="2721"/>
+            <w:shd w:val="clear" w:color="auto" w:fill="0C294B"/>
+          </w:tcPr>
+          <w:p>
+            <w:pPr>
+              <w:keepNext/>
+            </w:pPr>
+            <w:r/>
+            <w:r>
+              <w:rPr>
+                <w:b/>
+                <w:color w:val="FFFFFF"/>
+                <w:sz w:val="19"/>
+              </w:rPr>
+              <w:t>Named target</w:t>
+            </w:r>
+          </w:p>
+        </w:tc>
+      </w:tr>
+      <w:tr>
+        <w:tc>
+          <w:tcPr>
+            <w:tcW w:type="dxa" w:w="2494"/>
+          </w:tcPr>
+          <w:p>
+            <w:pPr>
+              <w:keepNext/>
+            </w:pPr>
+            <w:r/>
+            <w:r>
+              <w:rPr>
+                <w:b/>
+                <w:sz w:val="19"/>
+              </w:rPr>
+              <w:t>CatalogONE Centralized</w:t>
+            </w:r>
+          </w:p>
+        </w:tc>
+        <w:tc>
+          <w:tcPr>
+            <w:tcW w:type="dxa" w:w="4195"/>
+          </w:tcPr>
+          <w:p>
+            <w:pPr>
+              <w:keepNext/>
+            </w:pPr>
+            <w:r/>
+            <w:r>
+              <w:rPr>
+                <w:sz w:val="19"/>
+              </w:rPr>
+              <w:t>Author once; publish to multiple consuming applications [A]</w:t>
+            </w:r>
+          </w:p>
+        </w:tc>
+        <w:tc>
+          <w:tcPr>
+            <w:tcW w:type="dxa" w:w="2721"/>
+          </w:tcPr>
+          <w:p>
+            <w:pPr>
+              <w:keepNext/>
+            </w:pPr>
+            <w:r/>
+            <w:r>
+              <w:rPr>
+                <w:sz w:val="19"/>
+              </w:rPr>
+              <w:t>Consuming applications (not named as Dynamics)</w:t>
+            </w:r>
+          </w:p>
+        </w:tc>
+      </w:tr>
+      <w:tr>
+        <w:tc>
+          <w:tcPr>
+            <w:tcW w:type="dxa" w:w="2494"/>
+          </w:tcPr>
+          <w:p>
+            <w:pPr>
+              <w:keepNext/>
+            </w:pPr>
+            <w:r/>
+            <w:r>
+              <w:rPr>
+                <w:b/>
+                <w:sz w:val="19"/>
+              </w:rPr>
+              <w:t>Kafka distribution</w:t>
+            </w:r>
+          </w:p>
+        </w:tc>
+        <w:tc>
+          <w:tcPr>
+            <w:tcW w:type="dxa" w:w="4195"/>
+          </w:tcPr>
+          <w:p>
+            <w:pPr>
+              <w:keepNext/>
+            </w:pPr>
+            <w:r/>
+            <w:r>
+              <w:rPr>
+                <w:sz w:val="19"/>
+              </w:rPr>
+              <w:t>Synchronise catalog definitions to other systems in minutes [P]</w:t>
+            </w:r>
+          </w:p>
+        </w:tc>
+        <w:tc>
+          <w:tcPr>
+            <w:tcW w:type="dxa" w:w="2721"/>
+          </w:tcPr>
+          <w:p>
+            <w:pPr>
+              <w:keepNext/>
+            </w:pPr>
+            <w:r/>
+            <w:r>
+              <w:rPr>
+                <w:sz w:val="19"/>
+              </w:rPr>
+              <w:t>Federated / downstream systems</w:t>
+            </w:r>
+          </w:p>
+        </w:tc>
+      </w:tr>
+      <w:tr>
+        <w:tc>
+          <w:tcPr>
+            <w:tcW w:type="dxa" w:w="2494"/>
+          </w:tcPr>
+          <w:p>
+            <w:pPr>
+              <w:keepNext/>
+            </w:pPr>
+            <w:r/>
+            <w:r>
+              <w:rPr>
+                <w:b/>
+                <w:sz w:val="19"/>
+              </w:rPr>
+              <w:t>TMF Open APIs (TMF620 and related)</w:t>
+            </w:r>
+          </w:p>
+        </w:tc>
+        <w:tc>
+          <w:tcPr>
+            <w:tcW w:type="dxa" w:w="4195"/>
+          </w:tcPr>
+          <w:p>
+            <w:pPr>
+              <w:keepNext/>
+            </w:pPr>
+            <w:r/>
+            <w:r>
+              <w:rPr>
+                <w:sz w:val="19"/>
+              </w:rPr>
+              <w:t>API-first, TMF data model; Amdocs is certified on TMF620 [A][T]</w:t>
+            </w:r>
+          </w:p>
+        </w:tc>
+        <w:tc>
+          <w:tcPr>
+            <w:tcW w:type="dxa" w:w="2721"/>
+          </w:tcPr>
+          <w:p>
+            <w:pPr>
+              <w:keepNext/>
+            </w:pPr>
+            <w:r/>
+            <w:r>
+              <w:rPr>
+                <w:sz w:val="19"/>
+              </w:rPr>
+              <w:t>Any system that consumes TMF620</w:t>
+            </w:r>
+          </w:p>
+        </w:tc>
+      </w:tr>
+      <w:tr>
+        <w:tc>
+          <w:tcPr>
+            <w:tcW w:type="dxa" w:w="2494"/>
+          </w:tcPr>
+          <w:p>
+            <w:r/>
+            <w:r>
+              <w:rPr>
+                <w:b/>
+                <w:sz w:val="19"/>
+              </w:rPr>
+              <w:t>CPQ + CRM</w:t>
+            </w:r>
+          </w:p>
+        </w:tc>
+        <w:tc>
+          <w:tcPr>
+            <w:tcW w:type="dxa" w:w="4195"/>
+          </w:tcPr>
+          <w:p>
+            <w:r/>
+            <w:r>
+              <w:rPr>
+                <w:sz w:val="19"/>
+              </w:rPr>
+              <w:t>"integration to Amdocs CPQ and the customer's CRM solution" [A]</w:t>
+            </w:r>
+          </w:p>
+        </w:tc>
+        <w:tc>
+          <w:tcPr>
+            <w:tcW w:type="dxa" w:w="2721"/>
+          </w:tcPr>
+          <w:p>
+            <w:r/>
+            <w:r>
+              <w:rPr>
+                <w:sz w:val="19"/>
+              </w:rPr>
+              <w:t>The operator's CRM (unnamed)</w:t>
+            </w:r>
+          </w:p>
+        </w:tc>
+      </w:tr>
+    </w:tbl>
+    <w:p/>
     <w:p>
       <w:pPr>
         <w:pStyle w:val="Heading2"/>
       </w:pPr>
       <w:r>
-        <w:t>4.2 Where Catalog sits relative to Dynamics</w:t>
+        <w:t>4.2 What the Amdocs–Microsoft platform documents: Catalog next to Dynamics 365</w:t>
+      </w:r>
+    </w:p>
+    <w:p>
+      <w:r>
+        <w:rPr>
+          <w:i w:val="0"/>
+        </w:rPr>
+        <w:t>Separately, Amdocs and Microsoft sell the Customer Engagement Platform. That product "leverages … a unified Catalog, CPQ, Commerce and Order Management, and adds Microsoft's Dynamics 365 modules focused on sales, marketing, and customer service" [A]. AppSource lists it as a Dynamics 365 offering, with "Unified Catalog Serving the Entire Platform" [A].</w:t>
+      </w:r>
+    </w:p>
+    <w:p>
+      <w:r>
+        <w:rPr>
+          <w:i w:val="0"/>
+        </w:rPr>
+        <w:t>In CEP papers Amdocs says "Catalog", not "CatalogONE". CatalogONE is Amdocs' catalog/PLM product, so it is the natural catalog in that stack, but that identification is not written as "CatalogONE → Dynamics 365" [A][E].</w:t>
       </w:r>
     </w:p>
     <w:p>
@@ -6112,15 +6446,7 @@
           <w:color w:val="5F5A6B"/>
           <w:sz w:val="18"/>
         </w:rPr>
-        <w:t>Figure 4. Platform architecture: Catalog is a module of its own, next to Marketing, Sales, CPQ, Commerce &amp; Order Management and Customer Service. Sales in this stack is Dynamics 365. Source: Amdocs and Microsoft Customer Engagement Platform paper, p.3 [A].</w:t>
-      </w:r>
-    </w:p>
-    <w:p>
-      <w:r>
-        <w:rPr>
-          <w:i w:val="0"/>
-        </w:rPr>
-        <w:t>The same paper states that the platform "leverages the industry-leading Amdocs Commerce &amp; Care Suite, including a unified Catalog, CPQ, Commerce and Order Management, and adds Microsoft's Dynamics 365 modules focused on sales, marketing, and customer service" [A]. CatalogONE is that unified catalog.</w:t>
+        <w:t>Figure 4. CEP architecture: Catalog is its own module, next to Sales. In this platform Sales is Dynamics 365. Source: Amdocs and Microsoft Customer Engagement Platform paper, p.3 [A].</w:t>
       </w:r>
     </w:p>
     <w:p>
@@ -6172,7 +6498,31 @@
           <w:color w:val="5F5A6B"/>
           <w:sz w:val="18"/>
         </w:rPr>
-        <w:t>Figure 5. Complementary stack: "Digital Enterprise Catalog" on the Amdocs side, "Sales management" on the CRM side, around one Customer Engagement Platform. Source: Amdocs–Microsoft CEP paper, p.4 [A].</w:t>
+        <w:t>Figure 5. Complementary stack: Digital Enterprise Catalog (Amdocs) and Sales management (Dynamics) on one platform. Source: Amdocs–Microsoft CEP paper, p.4 [A].</w:t>
+      </w:r>
+    </w:p>
+    <w:p>
+      <w:r>
+        <w:rPr>
+          <w:i w:val="0"/>
+        </w:rPr>
+        <w:t>CEP also states that agent actions are "captured and updated across all relevant billing, CRM, operations, and product databases" [A]. That is platform-level sync, not a CatalogONE API named in a CatalogONE datasheet.</w:t>
+      </w:r>
+    </w:p>
+    <w:p>
+      <w:r>
+        <w:rPr>
+          <w:i w:val="0"/>
+        </w:rPr>
+        <w:t>A live operator on CEP is PLDT (Philippines). Amdocs announced the go-live on 7 May 2025. Agents use Microsoft Copilot and Microsoft Dynamics 365, with network validation and real-time dashboards [A]. In June 2026 IDC published a case study (Christopher Silberberg and Ahmad Latif Ali) on PLDT Unified Case Management on CEP: six weeks after go-live, 48% faster L1 ticket resolution and a 27-point NPS increase on the targeted use cases [A][I].</w:t>
+      </w:r>
+    </w:p>
+    <w:p>
+      <w:r>
+        <w:rPr>
+          <w:i w:val="0"/>
+        </w:rPr>
+        <w:t>That IDC paper is customer care: ticketing and case handling on CEP, with Dynamics 365 as the agent workspace. The May 2025 go-live also mentions faster service rollouts at platform level. Neither source describes CatalogONE publishing product-catalog data into Dynamics 365 Sales [A][I].</w:t>
       </w:r>
     </w:p>
     <w:p>
@@ -6180,407 +6530,7 @@
         <w:pStyle w:val="Heading2"/>
       </w:pPr>
       <w:r>
-        <w:t>4.3 What gets published</w:t>
-      </w:r>
-    </w:p>
-    <w:tbl>
-      <w:tblPr>
-        <w:tblStyle w:val="TableGrid"/>
-        <w:tblW w:type="auto" w:w="0"/>
-        <w:jc w:val="center"/>
-        <w:tblLayout w:type="fixed"/>
-        <w:tblLook w:firstColumn="1" w:firstRow="1" w:lastColumn="0" w:lastRow="0" w:noHBand="0" w:noVBand="1" w:val="04A0"/>
-      </w:tblPr>
-      <w:tblGrid>
-        <w:gridCol w:w="3061"/>
-        <w:gridCol w:w="4989"/>
-        <w:gridCol w:w="1361"/>
-      </w:tblGrid>
-      <w:tr>
-        <w:tc>
-          <w:tcPr>
-            <w:tcW w:type="dxa" w:w="3061"/>
-            <w:shd w:val="clear" w:color="auto" w:fill="0C294B"/>
-          </w:tcPr>
-          <w:p>
-            <w:pPr>
-              <w:keepNext/>
-            </w:pPr>
-            <w:r/>
-            <w:r>
-              <w:rPr>
-                <w:b/>
-                <w:color w:val="FFFFFF"/>
-                <w:sz w:val="19"/>
-              </w:rPr>
-              <w:t>Item</w:t>
-            </w:r>
-          </w:p>
-        </w:tc>
-        <w:tc>
-          <w:tcPr>
-            <w:tcW w:type="dxa" w:w="4989"/>
-            <w:shd w:val="clear" w:color="auto" w:fill="0C294B"/>
-          </w:tcPr>
-          <w:p>
-            <w:pPr>
-              <w:keepNext/>
-            </w:pPr>
-            <w:r/>
-            <w:r>
-              <w:rPr>
-                <w:b/>
-                <w:color w:val="FFFFFF"/>
-                <w:sz w:val="19"/>
-              </w:rPr>
-              <w:t>Why Dynamics needs it</w:t>
-            </w:r>
-          </w:p>
-        </w:tc>
-        <w:tc>
-          <w:tcPr>
-            <w:tcW w:type="dxa" w:w="1361"/>
-            <w:shd w:val="clear" w:color="auto" w:fill="0C294B"/>
-          </w:tcPr>
-          <w:p>
-            <w:pPr>
-              <w:keepNext/>
-            </w:pPr>
-            <w:r/>
-            <w:r>
-              <w:rPr>
-                <w:b/>
-                <w:color w:val="FFFFFF"/>
-                <w:sz w:val="19"/>
-              </w:rPr>
-              <w:t>Source</w:t>
-            </w:r>
-          </w:p>
-        </w:tc>
-      </w:tr>
-      <w:tr>
-        <w:tc>
-          <w:tcPr>
-            <w:tcW w:type="dxa" w:w="3061"/>
-          </w:tcPr>
-          <w:p>
-            <w:pPr>
-              <w:keepNext/>
-            </w:pPr>
-            <w:r/>
-            <w:r>
-              <w:rPr>
-                <w:b/>
-                <w:sz w:val="19"/>
-              </w:rPr>
-              <w:t>Offering and bundle structure</w:t>
-            </w:r>
-          </w:p>
-        </w:tc>
-        <w:tc>
-          <w:tcPr>
-            <w:tcW w:type="dxa" w:w="4989"/>
-          </w:tcPr>
-          <w:p>
-            <w:pPr>
-              <w:keepNext/>
-            </w:pPr>
-            <w:r/>
-            <w:r>
-              <w:rPr>
-                <w:sz w:val="19"/>
-              </w:rPr>
-              <w:t>So the salesperson can select the product and its add-ons</w:t>
-            </w:r>
-          </w:p>
-        </w:tc>
-        <w:tc>
-          <w:tcPr>
-            <w:tcW w:type="dxa" w:w="1361"/>
-          </w:tcPr>
-          <w:p>
-            <w:pPr>
-              <w:keepNext/>
-            </w:pPr>
-            <w:r/>
-            <w:r>
-              <w:rPr>
-                <w:sz w:val="19"/>
-              </w:rPr>
-              <w:t>[A][S]</w:t>
-            </w:r>
-          </w:p>
-        </w:tc>
-      </w:tr>
-      <w:tr>
-        <w:tc>
-          <w:tcPr>
-            <w:tcW w:type="dxa" w:w="3061"/>
-          </w:tcPr>
-          <w:p>
-            <w:pPr>
-              <w:keepNext/>
-            </w:pPr>
-            <w:r/>
-            <w:r>
-              <w:rPr>
-                <w:b/>
-                <w:sz w:val="19"/>
-              </w:rPr>
-              <w:t>Prices, discounts, contract terms</w:t>
-            </w:r>
-          </w:p>
-        </w:tc>
-        <w:tc>
-          <w:tcPr>
-            <w:tcW w:type="dxa" w:w="4989"/>
-          </w:tcPr>
-          <w:p>
-            <w:pPr>
-              <w:keepNext/>
-            </w:pPr>
-            <w:r/>
-            <w:r>
-              <w:rPr>
-                <w:sz w:val="19"/>
-              </w:rPr>
-              <w:t>So the quote price is always the approved price</w:t>
-            </w:r>
-          </w:p>
-        </w:tc>
-        <w:tc>
-          <w:tcPr>
-            <w:tcW w:type="dxa" w:w="1361"/>
-          </w:tcPr>
-          <w:p>
-            <w:pPr>
-              <w:keepNext/>
-            </w:pPr>
-            <w:r/>
-            <w:r>
-              <w:rPr>
-                <w:sz w:val="19"/>
-              </w:rPr>
-              <w:t>[A][S][M]</w:t>
-            </w:r>
-          </w:p>
-        </w:tc>
-      </w:tr>
-      <w:tr>
-        <w:tc>
-          <w:tcPr>
-            <w:tcW w:type="dxa" w:w="3061"/>
-          </w:tcPr>
-          <w:p>
-            <w:pPr>
-              <w:keepNext/>
-            </w:pPr>
-            <w:r/>
-            <w:r>
-              <w:rPr>
-                <w:b/>
-                <w:sz w:val="19"/>
-              </w:rPr>
-              <w:t>Eligibility (channel, segment, market)</w:t>
-            </w:r>
-          </w:p>
-        </w:tc>
-        <w:tc>
-          <w:tcPr>
-            <w:tcW w:type="dxa" w:w="4989"/>
-          </w:tcPr>
-          <w:p>
-            <w:pPr>
-              <w:keepNext/>
-            </w:pPr>
-            <w:r/>
-            <w:r>
-              <w:rPr>
-                <w:sz w:val="19"/>
-              </w:rPr>
-              <w:t>So Dynamics / CPQ only shows products the customer can buy</w:t>
-            </w:r>
-          </w:p>
-        </w:tc>
-        <w:tc>
-          <w:tcPr>
-            <w:tcW w:type="dxa" w:w="1361"/>
-          </w:tcPr>
-          <w:p>
-            <w:pPr>
-              <w:keepNext/>
-            </w:pPr>
-            <w:r/>
-            <w:r>
-              <w:rPr>
-                <w:sz w:val="19"/>
-              </w:rPr>
-              <w:t>[A]</w:t>
-            </w:r>
-          </w:p>
-        </w:tc>
-      </w:tr>
-      <w:tr>
-        <w:tc>
-          <w:tcPr>
-            <w:tcW w:type="dxa" w:w="3061"/>
-          </w:tcPr>
-          <w:p>
-            <w:pPr>
-              <w:keepNext/>
-            </w:pPr>
-            <w:r/>
-            <w:r>
-              <w:rPr>
-                <w:b/>
-                <w:sz w:val="19"/>
-              </w:rPr>
-              <w:t>Dependencies and constraints</w:t>
-            </w:r>
-          </w:p>
-        </w:tc>
-        <w:tc>
-          <w:tcPr>
-            <w:tcW w:type="dxa" w:w="4989"/>
-          </w:tcPr>
-          <w:p>
-            <w:pPr>
-              <w:keepNext/>
-            </w:pPr>
-            <w:r/>
-            <w:r>
-              <w:rPr>
-                <w:sz w:val="19"/>
-              </w:rPr>
-              <w:t>So invalid combinations cannot be quoted</w:t>
-            </w:r>
-          </w:p>
-        </w:tc>
-        <w:tc>
-          <w:tcPr>
-            <w:tcW w:type="dxa" w:w="1361"/>
-          </w:tcPr>
-          <w:p>
-            <w:pPr>
-              <w:keepNext/>
-            </w:pPr>
-            <w:r/>
-            <w:r>
-              <w:rPr>
-                <w:sz w:val="19"/>
-              </w:rPr>
-              <w:t>[A]</w:t>
-            </w:r>
-          </w:p>
-        </w:tc>
-      </w:tr>
-      <w:tr>
-        <w:tc>
-          <w:tcPr>
-            <w:tcW w:type="dxa" w:w="3061"/>
-          </w:tcPr>
-          <w:p>
-            <w:pPr>
-              <w:keepNext/>
-            </w:pPr>
-            <w:r/>
-            <w:r>
-              <w:rPr>
-                <w:b/>
-                <w:sz w:val="19"/>
-              </w:rPr>
-              <w:t>Validity dates (start and end of sale)</w:t>
-            </w:r>
-          </w:p>
-        </w:tc>
-        <w:tc>
-          <w:tcPr>
-            <w:tcW w:type="dxa" w:w="4989"/>
-          </w:tcPr>
-          <w:p>
-            <w:pPr>
-              <w:keepNext/>
-            </w:pPr>
-            <w:r/>
-            <w:r>
-              <w:rPr>
-                <w:sz w:val="19"/>
-              </w:rPr>
-              <w:t>So the product appears and disappears on time</w:t>
-            </w:r>
-          </w:p>
-        </w:tc>
-        <w:tc>
-          <w:tcPr>
-            <w:tcW w:type="dxa" w:w="1361"/>
-          </w:tcPr>
-          <w:p>
-            <w:pPr>
-              <w:keepNext/>
-            </w:pPr>
-            <w:r/>
-            <w:r>
-              <w:rPr>
-                <w:sz w:val="19"/>
-              </w:rPr>
-              <w:t>[S]</w:t>
-            </w:r>
-          </w:p>
-        </w:tc>
-      </w:tr>
-      <w:tr>
-        <w:tc>
-          <w:tcPr>
-            <w:tcW w:type="dxa" w:w="3061"/>
-          </w:tcPr>
-          <w:p>
-            <w:r/>
-            <w:r>
-              <w:rPr>
-                <w:b/>
-                <w:sz w:val="19"/>
-              </w:rPr>
-              <w:t>Lifecycle status and version</w:t>
-            </w:r>
-          </w:p>
-        </w:tc>
-        <w:tc>
-          <w:tcPr>
-            <w:tcW w:type="dxa" w:w="4989"/>
-          </w:tcPr>
-          <w:p>
-            <w:r/>
-            <w:r>
-              <w:rPr>
-                <w:sz w:val="19"/>
-              </w:rPr>
-              <w:t>So Dynamics knows which version is sellable</w:t>
-            </w:r>
-          </w:p>
-        </w:tc>
-        <w:tc>
-          <w:tcPr>
-            <w:tcW w:type="dxa" w:w="1361"/>
-          </w:tcPr>
-          <w:p>
-            <w:r/>
-            <w:r>
-              <w:rPr>
-                <w:sz w:val="19"/>
-              </w:rPr>
-              <w:t>[S][M]</w:t>
-            </w:r>
-          </w:p>
-        </w:tc>
-      </w:tr>
-    </w:tbl>
-    <w:p/>
-    <w:p>
-      <w:pPr>
-        <w:pStyle w:val="Heading2"/>
-      </w:pPr>
-      <w:r>
-        <w:t>4.4 When it gets published</w:t>
+        <w:t>4.3 What is not publicly documented</w:t>
       </w:r>
     </w:p>
     <w:p>
@@ -6588,7 +6538,7 @@
         <w:pStyle w:val="ListBullet"/>
       </w:pPr>
       <w:r>
-        <w:t>Only products that have passed test (Active) are published; anything In Study, In Design or In Test stays inside CatalogONE [S][A].</w:t>
+        <w:t>A CatalogONE product page, datasheet or API guide that names Microsoft Dynamics 365 as the destination.</w:t>
       </w:r>
     </w:p>
     <w:p>
@@ -6596,7 +6546,7 @@
         <w:pStyle w:val="ListBullet"/>
       </w:pPr>
       <w:r>
-        <w:t>Launch to all channels is described as configure-once, including the B2B portal [A]. Dynamics 365 is the enterprise sales channel in this pattern [A][E].</w:t>
+        <w:t>An AppSource app called CatalogONE for Dynamics.</w:t>
       </w:r>
     </w:p>
     <w:p>
@@ -6604,7 +6554,7 @@
         <w:pStyle w:val="ListBullet"/>
       </w:pPr>
       <w:r>
-        <w:t>The start of marketing (Active to Launched) can follow the offering's validity start date, so a product can be prepared in advance and go on sale on a planned date [S].</w:t>
+        <w:t>A vendor field mapping from CatalogONE / TMF620 entities onto Dataverse Product, Price list item and Bundle.</w:t>
       </w:r>
     </w:p>
     <w:p>
@@ -6612,7 +6562,15 @@
         <w:pStyle w:val="ListBullet"/>
       </w:pPr>
       <w:r>
-        <w:t>Publication can be limited to chosen channels and segments through the rules defined in Stage 5 [A].</w:t>
+        <w:t>Whether CatalogONE can be plugged into an existing Dynamics 365 Sales org (such as WE Data) without buying the full Customer Engagement Platform.</w:t>
+      </w:r>
+    </w:p>
+    <w:p>
+      <w:pPr>
+        <w:pStyle w:val="ListBullet"/>
+      </w:pPr>
+      <w:r>
+        <w:t>Any sentence in the IDC PLDT case study that says CatalogONE sends catalog data to Dynamics 365. That paper is Unified Case Management on CEP.</w:t>
       </w:r>
     </w:p>
     <w:p>
@@ -6620,7 +6578,7 @@
         <w:pStyle w:val="Heading2"/>
       </w:pPr>
       <w:r>
-        <w:t>4.5 How it is published</w:t>
+        <w:t>4.4 Example only: how TMF620 items would land in Dynamics 365 Sales [E][M]</w:t>
       </w:r>
     </w:p>
     <w:p>
@@ -6628,425 +6586,7 @@
         <w:rPr>
           <w:i w:val="0"/>
         </w:rPr>
-        <w:t>Two documented mechanisms work together [A][P][S]:</w:t>
-      </w:r>
-    </w:p>
-    <w:p>
-      <w:pPr>
-        <w:spacing w:after="60"/>
-        <w:ind w:left="454" w:hanging="340"/>
-      </w:pPr>
-      <w:r>
-        <w:rPr>
-          <w:b/>
-          <w:color w:val="0C294B"/>
-        </w:rPr>
-        <w:t xml:space="preserve">1.  </w:t>
-      </w:r>
-      <w:r>
-        <w:t>Master-catalog publish. CatalogONE Centralized "enables centralized authoring … publishing catalog information to multiple consuming applications" [A]. Dynamics 365 is one consuming application.</w:t>
-      </w:r>
-    </w:p>
-    <w:p>
-      <w:pPr>
-        <w:spacing w:after="60"/>
-        <w:ind w:left="454" w:hanging="340"/>
-      </w:pPr>
-      <w:r>
-        <w:rPr>
-          <w:b/>
-          <w:color w:val="0C294B"/>
-        </w:rPr>
-        <w:t xml:space="preserve">2.  </w:t>
-      </w:r>
-      <w:r>
-        <w:t>Event distribution. CatalogONE uses a Kafka bus to synchronise definitions between systems in minutes rather than weeks, so a business-owner approval can replace an IT ticket [P].</w:t>
-      </w:r>
-    </w:p>
-    <w:p>
-      <w:pPr>
-        <w:spacing w:after="60"/>
-        <w:ind w:left="454" w:hanging="340"/>
-      </w:pPr>
-      <w:r>
-        <w:rPr>
-          <w:b/>
-          <w:color w:val="0C294B"/>
-        </w:rPr>
-        <w:t xml:space="preserve">3.  </w:t>
-      </w:r>
-      <w:r>
-        <w:t>Standard APIs. CatalogONE microservices expose TM Forum Open APIs. Amdocs is certified on TMF620 (Product Catalog Management). TMF620 events notify consumers when an offering is created, changed or changes status [A][T][S].</w:t>
-      </w:r>
-    </w:p>
-    <w:p>
-      <w:pPr>
-        <w:spacing w:after="60"/>
-        <w:ind w:left="454" w:hanging="340"/>
-      </w:pPr>
-      <w:r>
-        <w:rPr>
-          <w:b/>
-          <w:color w:val="0C294B"/>
-        </w:rPr>
-        <w:t xml:space="preserve">4.  </w:t>
-      </w:r>
-      <w:r>
-        <w:t>Qualification at quote time. TMF679 Product Offering Qualification lets the sales channel ask "can this customer get this offer here?" against the catalog rules [T][S].</w:t>
-      </w:r>
-    </w:p>
-    <w:tbl>
-      <w:tblPr>
-        <w:tblStyle w:val="TableGrid"/>
-        <w:tblW w:type="auto" w:w="0"/>
-        <w:jc w:val="center"/>
-        <w:tblLayout w:type="fixed"/>
-        <w:tblLook w:firstColumn="1" w:firstRow="1" w:lastColumn="0" w:lastRow="0" w:noHBand="0" w:noVBand="1" w:val="04A0"/>
-      </w:tblPr>
-      <w:tblGrid>
-        <w:gridCol w:w="2721"/>
-        <w:gridCol w:w="4195"/>
-        <w:gridCol w:w="2494"/>
-      </w:tblGrid>
-      <w:tr>
-        <w:tc>
-          <w:tcPr>
-            <w:tcW w:type="dxa" w:w="2721"/>
-            <w:shd w:val="clear" w:color="auto" w:fill="0C294B"/>
-          </w:tcPr>
-          <w:p>
-            <w:pPr>
-              <w:keepNext/>
-            </w:pPr>
-            <w:r/>
-            <w:r>
-              <w:rPr>
-                <w:b/>
-                <w:color w:val="FFFFFF"/>
-                <w:sz w:val="19"/>
-              </w:rPr>
-              <w:t>API / mechanism</w:t>
-            </w:r>
-          </w:p>
-        </w:tc>
-        <w:tc>
-          <w:tcPr>
-            <w:tcW w:type="dxa" w:w="4195"/>
-            <w:shd w:val="clear" w:color="auto" w:fill="0C294B"/>
-          </w:tcPr>
-          <w:p>
-            <w:pPr>
-              <w:keepNext/>
-            </w:pPr>
-            <w:r/>
-            <w:r>
-              <w:rPr>
-                <w:b/>
-                <w:color w:val="FFFFFF"/>
-                <w:sz w:val="19"/>
-              </w:rPr>
-              <w:t>What it does in the hand-over</w:t>
-            </w:r>
-          </w:p>
-        </w:tc>
-        <w:tc>
-          <w:tcPr>
-            <w:tcW w:type="dxa" w:w="2494"/>
-            <w:shd w:val="clear" w:color="auto" w:fill="0C294B"/>
-          </w:tcPr>
-          <w:p>
-            <w:pPr>
-              <w:keepNext/>
-            </w:pPr>
-            <w:r/>
-            <w:r>
-              <w:rPr>
-                <w:b/>
-                <w:color w:val="FFFFFF"/>
-                <w:sz w:val="19"/>
-              </w:rPr>
-              <w:t>Evidence</w:t>
-            </w:r>
-          </w:p>
-        </w:tc>
-      </w:tr>
-      <w:tr>
-        <w:tc>
-          <w:tcPr>
-            <w:tcW w:type="dxa" w:w="2721"/>
-          </w:tcPr>
-          <w:p>
-            <w:pPr>
-              <w:keepNext/>
-            </w:pPr>
-            <w:r/>
-            <w:r>
-              <w:rPr>
-                <w:b/>
-                <w:sz w:val="19"/>
-              </w:rPr>
-              <w:t>TMF620 Product Catalog Management</w:t>
-            </w:r>
-          </w:p>
-        </w:tc>
-        <w:tc>
-          <w:tcPr>
-            <w:tcW w:type="dxa" w:w="4195"/>
-          </w:tcPr>
-          <w:p>
-            <w:pPr>
-              <w:keepNext/>
-            </w:pPr>
-            <w:r/>
-            <w:r>
-              <w:rPr>
-                <w:sz w:val="19"/>
-              </w:rPr>
-              <w:t>Dynamics (or the integration layer) reads catalogs, offerings, prices, specifications</w:t>
-            </w:r>
-          </w:p>
-        </w:tc>
-        <w:tc>
-          <w:tcPr>
-            <w:tcW w:type="dxa" w:w="2494"/>
-          </w:tcPr>
-          <w:p>
-            <w:pPr>
-              <w:keepNext/>
-            </w:pPr>
-            <w:r/>
-            <w:r>
-              <w:rPr>
-                <w:sz w:val="19"/>
-              </w:rPr>
-              <w:t>Amdocs certified [T]; CatalogONE API-first [A]</w:t>
-            </w:r>
-          </w:p>
-        </w:tc>
-      </w:tr>
-      <w:tr>
-        <w:tc>
-          <w:tcPr>
-            <w:tcW w:type="dxa" w:w="2721"/>
-          </w:tcPr>
-          <w:p>
-            <w:pPr>
-              <w:keepNext/>
-            </w:pPr>
-            <w:r/>
-            <w:r>
-              <w:rPr>
-                <w:b/>
-                <w:sz w:val="19"/>
-              </w:rPr>
-              <w:t>TMF620 event notifications</w:t>
-            </w:r>
-          </w:p>
-        </w:tc>
-        <w:tc>
-          <w:tcPr>
-            <w:tcW w:type="dxa" w:w="4195"/>
-          </w:tcPr>
-          <w:p>
-            <w:pPr>
-              <w:keepNext/>
-            </w:pPr>
-            <w:r/>
-            <w:r>
-              <w:rPr>
-                <w:sz w:val="19"/>
-              </w:rPr>
-              <w:t>Dynamics stays in sync on create / change / status change, without re-keying</w:t>
-            </w:r>
-          </w:p>
-        </w:tc>
-        <w:tc>
-          <w:tcPr>
-            <w:tcW w:type="dxa" w:w="2494"/>
-          </w:tcPr>
-          <w:p>
-            <w:pPr>
-              <w:keepNext/>
-            </w:pPr>
-            <w:r/>
-            <w:r>
-              <w:rPr>
-                <w:sz w:val="19"/>
-              </w:rPr>
-              <w:t>Part of TMF620 [S]; Kafka distribution [P]</w:t>
-            </w:r>
-          </w:p>
-        </w:tc>
-      </w:tr>
-      <w:tr>
-        <w:tc>
-          <w:tcPr>
-            <w:tcW w:type="dxa" w:w="2721"/>
-          </w:tcPr>
-          <w:p>
-            <w:pPr>
-              <w:keepNext/>
-            </w:pPr>
-            <w:r/>
-            <w:r>
-              <w:rPr>
-                <w:b/>
-                <w:sz w:val="19"/>
-              </w:rPr>
-              <w:t>TMF679 Product Offering Qualification</w:t>
-            </w:r>
-          </w:p>
-        </w:tc>
-        <w:tc>
-          <w:tcPr>
-            <w:tcW w:type="dxa" w:w="4195"/>
-          </w:tcPr>
-          <w:p>
-            <w:pPr>
-              <w:keepNext/>
-            </w:pPr>
-            <w:r/>
-            <w:r>
-              <w:rPr>
-                <w:sz w:val="19"/>
-              </w:rPr>
-              <w:t>At quote time: can this customer get this offer here?</w:t>
-            </w:r>
-          </w:p>
-        </w:tc>
-        <w:tc>
-          <w:tcPr>
-            <w:tcW w:type="dxa" w:w="2494"/>
-          </w:tcPr>
-          <w:p>
-            <w:pPr>
-              <w:keepNext/>
-            </w:pPr>
-            <w:r/>
-            <w:r>
-              <w:rPr>
-                <w:sz w:val="19"/>
-              </w:rPr>
-              <w:t>Used with Amdocs DigitalONE at Sprint [T]</w:t>
-            </w:r>
-          </w:p>
-        </w:tc>
-      </w:tr>
-      <w:tr>
-        <w:tc>
-          <w:tcPr>
-            <w:tcW w:type="dxa" w:w="2721"/>
-          </w:tcPr>
-          <w:p>
-            <w:pPr>
-              <w:keepNext/>
-            </w:pPr>
-            <w:r/>
-            <w:r>
-              <w:rPr>
-                <w:b/>
-                <w:sz w:val="19"/>
-              </w:rPr>
-              <w:t>TMF622 Product Ordering</w:t>
-            </w:r>
-          </w:p>
-        </w:tc>
-        <w:tc>
-          <w:tcPr>
-            <w:tcW w:type="dxa" w:w="4195"/>
-          </w:tcPr>
-          <w:p>
-            <w:pPr>
-              <w:keepNext/>
-            </w:pPr>
-            <w:r/>
-            <w:r>
-              <w:rPr>
-                <w:sz w:val="19"/>
-              </w:rPr>
-              <w:t>The order references the offering ID and version</w:t>
-            </w:r>
-          </w:p>
-        </w:tc>
-        <w:tc>
-          <w:tcPr>
-            <w:tcW w:type="dxa" w:w="2494"/>
-          </w:tcPr>
-          <w:p>
-            <w:pPr>
-              <w:keepNext/>
-            </w:pPr>
-            <w:r/>
-            <w:r>
-              <w:rPr>
-                <w:sz w:val="19"/>
-              </w:rPr>
-              <w:t>Amdocs certified [T]</w:t>
-            </w:r>
-          </w:p>
-        </w:tc>
-      </w:tr>
-      <w:tr>
-        <w:tc>
-          <w:tcPr>
-            <w:tcW w:type="dxa" w:w="2721"/>
-          </w:tcPr>
-          <w:p>
-            <w:r/>
-            <w:r>
-              <w:rPr>
-                <w:b/>
-                <w:sz w:val="19"/>
-              </w:rPr>
-              <w:t>Kafka catalog distribution</w:t>
-            </w:r>
-          </w:p>
-        </w:tc>
-        <w:tc>
-          <w:tcPr>
-            <w:tcW w:type="dxa" w:w="4195"/>
-          </w:tcPr>
-          <w:p>
-            <w:r/>
-            <w:r>
-              <w:rPr>
-                <w:sz w:val="19"/>
-              </w:rPr>
-              <w:t>Push approved versions to CRM, CPQ, ordering in minutes</w:t>
-            </w:r>
-          </w:p>
-        </w:tc>
-        <w:tc>
-          <w:tcPr>
-            <w:tcW w:type="dxa" w:w="2494"/>
-          </w:tcPr>
-          <w:p>
-            <w:r/>
-            <w:r>
-              <w:rPr>
-                <w:sz w:val="19"/>
-              </w:rPr>
-              <w:t>Appledore profile of CatalogONE [P]</w:t>
-            </w:r>
-          </w:p>
-        </w:tc>
-      </w:tr>
-    </w:tbl>
-    <w:p/>
-    <w:p>
-      <w:pPr>
-        <w:pStyle w:val="Heading2"/>
-      </w:pPr>
-      <w:r>
-        <w:t>4.6 Mapping CatalogONE (TMF620) onto Dynamics 365 Sales</w:t>
-      </w:r>
-    </w:p>
-    <w:p>
-      <w:r>
-        <w:rPr>
-          <w:i w:val="0"/>
-        </w:rPr>
-        <w:t>Dynamics 365 Sales already has a product catalog [M]. In this pattern those tables are the destination, not the authoring system. An integration layer (the CEP pre-integration, or Azure / Dataverse Web API) maps as follows [A][M][E]:</w:t>
+        <w:t>If CatalogONE (or the CEP catalog) is the source of truth, and Dynamics 365 Sales is the CRM, the industry mapping is the same pattern used for any TMF620 catalog. The table is an illustration from Microsoft's product-catalog entities plus the TMF model. It is not copied from an Amdocs CatalogONE connector guide [E][M][S].</w:t>
       </w:r>
     </w:p>
     <w:tbl>
@@ -7078,7 +6618,7 @@
                 <w:color w:val="FFFFFF"/>
                 <w:sz w:val="19"/>
               </w:rPr>
-              <w:t>CatalogONE / TMF620</w:t>
+              <w:t>Catalog / TMF620 item</w:t>
             </w:r>
           </w:p>
         </w:tc>
@@ -7400,7 +6940,7 @@
         <w:rPr>
           <w:i/>
         </w:rPr>
-        <w:t>Dynamics product statuses are Draft, Active, Under Revision and Retired [M]. Study, design, test and approval stay in CatalogONE. Dynamics receives only products that are ready to sell. A later catalog version maps to Dynamics "Under Revision" then back to Active when the new version is published [M][E].</w:t>
+        <w:t>Dynamics product statuses are Draft, Active, Under Revision and Retired [M]. Study, design, test and approval would stay in CatalogONE; Dynamics would receive only products that are ready to sell [S][M][E].</w:t>
       </w:r>
     </w:p>
     <w:p>
@@ -7408,151 +6948,191 @@
         <w:pStyle w:val="Heading2"/>
       </w:pPr>
       <w:r>
-        <w:t>4.7 What the salesperson sees in Dynamics</w:t>
+        <w:t>4.5 Two practical paths, if Dynamics is already the CRM</w:t>
       </w:r>
     </w:p>
+    <w:tbl>
+      <w:tblPr>
+        <w:tblStyle w:val="TableGrid"/>
+        <w:tblW w:type="auto" w:w="0"/>
+        <w:jc w:val="center"/>
+        <w:tblLayout w:type="fixed"/>
+        <w:tblLook w:firstColumn="1" w:firstRow="1" w:lastColumn="0" w:lastRow="0" w:noHBand="0" w:noVBand="1" w:val="04A0"/>
+      </w:tblPr>
+      <w:tblGrid>
+        <w:gridCol w:w="2381"/>
+        <w:gridCol w:w="4535"/>
+        <w:gridCol w:w="2494"/>
+      </w:tblGrid>
+      <w:tr>
+        <w:tc>
+          <w:tcPr>
+            <w:tcW w:type="dxa" w:w="2381"/>
+            <w:shd w:val="clear" w:color="auto" w:fill="0C294B"/>
+          </w:tcPr>
+          <w:p>
+            <w:pPr>
+              <w:keepNext/>
+            </w:pPr>
+            <w:r/>
+            <w:r>
+              <w:rPr>
+                <w:b/>
+                <w:color w:val="FFFFFF"/>
+                <w:sz w:val="19"/>
+              </w:rPr>
+              <w:t>Path</w:t>
+            </w:r>
+          </w:p>
+        </w:tc>
+        <w:tc>
+          <w:tcPr>
+            <w:tcW w:type="dxa" w:w="4535"/>
+            <w:shd w:val="clear" w:color="auto" w:fill="0C294B"/>
+          </w:tcPr>
+          <w:p>
+            <w:pPr>
+              <w:keepNext/>
+            </w:pPr>
+            <w:r/>
+            <w:r>
+              <w:rPr>
+                <w:b/>
+                <w:color w:val="FFFFFF"/>
+                <w:sz w:val="19"/>
+              </w:rPr>
+              <w:t>What it is</w:t>
+            </w:r>
+          </w:p>
+        </w:tc>
+        <w:tc>
+          <w:tcPr>
+            <w:tcW w:type="dxa" w:w="2494"/>
+            <w:shd w:val="clear" w:color="auto" w:fill="0C294B"/>
+          </w:tcPr>
+          <w:p>
+            <w:pPr>
+              <w:keepNext/>
+            </w:pPr>
+            <w:r/>
+            <w:r>
+              <w:rPr>
+                <w:b/>
+                <w:color w:val="FFFFFF"/>
+                <w:sz w:val="19"/>
+              </w:rPr>
+              <w:t>Evidence</w:t>
+            </w:r>
+          </w:p>
+        </w:tc>
+      </w:tr>
+      <w:tr>
+        <w:tc>
+          <w:tcPr>
+            <w:tcW w:type="dxa" w:w="2381"/>
+          </w:tcPr>
+          <w:p>
+            <w:pPr>
+              <w:keepNext/>
+            </w:pPr>
+            <w:r/>
+            <w:r>
+              <w:rPr>
+                <w:b/>
+                <w:sz w:val="19"/>
+              </w:rPr>
+              <w:t>Buy / adopt CEP</w:t>
+            </w:r>
+          </w:p>
+        </w:tc>
+        <w:tc>
+          <w:tcPr>
+            <w:tcW w:type="dxa" w:w="4535"/>
+          </w:tcPr>
+          <w:p>
+            <w:pPr>
+              <w:keepNext/>
+            </w:pPr>
+            <w:r/>
+            <w:r>
+              <w:rPr>
+                <w:sz w:val="19"/>
+              </w:rPr>
+              <w:t>Amdocs Catalog + Dynamics 365 as one pre-integrated platform. PLDT is live on CEP customer service (Unified Case Management)</w:t>
+            </w:r>
+          </w:p>
+        </w:tc>
+        <w:tc>
+          <w:tcPr>
+            <w:tcW w:type="dxa" w:w="2494"/>
+          </w:tcPr>
+          <w:p>
+            <w:pPr>
+              <w:keepNext/>
+            </w:pPr>
+            <w:r/>
+            <w:r>
+              <w:rPr>
+                <w:sz w:val="19"/>
+              </w:rPr>
+              <w:t>Amdocs–Microsoft papers [A]; PLDT go-live and IDC case study [A][I]</w:t>
+            </w:r>
+          </w:p>
+        </w:tc>
+      </w:tr>
+      <w:tr>
+        <w:tc>
+          <w:tcPr>
+            <w:tcW w:type="dxa" w:w="2381"/>
+          </w:tcPr>
+          <w:p>
+            <w:r/>
+            <w:r>
+              <w:rPr>
+                <w:b/>
+                <w:sz w:val="19"/>
+              </w:rPr>
+              <w:t>Keep current Dynamics, add CatalogONE</w:t>
+            </w:r>
+          </w:p>
+        </w:tc>
+        <w:tc>
+          <w:tcPr>
+            <w:tcW w:type="dxa" w:w="4535"/>
+          </w:tcPr>
+          <w:p>
+            <w:r/>
+            <w:r>
+              <w:rPr>
+                <w:sz w:val="19"/>
+              </w:rPr>
+              <w:t>CatalogONE publishes via TMF620 / Kafka; an integration layer maps into Dataverse. This is how CatalogONE describes any CRM, not a boxed Dynamics connector</w:t>
+            </w:r>
+          </w:p>
+        </w:tc>
+        <w:tc>
+          <w:tcPr>
+            <w:tcW w:type="dxa" w:w="2494"/>
+          </w:tcPr>
+          <w:p>
+            <w:r/>
+            <w:r>
+              <w:rPr>
+                <w:sz w:val="19"/>
+              </w:rPr>
+              <w:t>CatalogONE: consuming applications + customer's CRM [A]; mapping is [E]</w:t>
+            </w:r>
+          </w:p>
+        </w:tc>
+      </w:tr>
+    </w:tbl>
+    <w:p/>
     <w:p>
       <w:r>
         <w:rPr>
           <w:i w:val="0"/>
         </w:rPr>
-        <w:t>When an enterprise account manager creates an opportunity or quote in Dynamics 365 Sales [M][E]:</w:t>
-      </w:r>
-    </w:p>
-    <w:p>
-      <w:pPr>
-        <w:pStyle w:val="ListBullet"/>
-      </w:pPr>
-      <w:r>
-        <w:t>Only published (Active) products and bundles appear.</w:t>
-      </w:r>
-    </w:p>
-    <w:p>
-      <w:pPr>
-        <w:pStyle w:val="ListBullet"/>
-      </w:pPr>
-      <w:r>
-        <w:t>Price list items come from the catalog prices that Finance approved.</w:t>
-      </w:r>
-    </w:p>
-    <w:p>
-      <w:pPr>
-        <w:pStyle w:val="ListBullet"/>
-      </w:pPr>
-      <w:r>
-        <w:t>Bundles and add-ons follow the structure built in CatalogONE Commerce.</w:t>
-      </w:r>
-    </w:p>
-    <w:p>
-      <w:pPr>
-        <w:pStyle w:val="ListBullet"/>
-      </w:pPr>
-      <w:r>
-        <w:t>Related products (backup link, extra IP block) appear as accessory / up-sell suggestions.</w:t>
-      </w:r>
-    </w:p>
-    <w:p>
-      <w:pPr>
-        <w:pStyle w:val="ListBullet"/>
-      </w:pPr>
-      <w:r>
-        <w:t>If CPQ is in the stack, serviceability, multi-level discounts and contract amendments are evaluated against the same catalog [A].</w:t>
-      </w:r>
-    </w:p>
-    <w:p>
-      <w:r>
-        <w:rPr>
-          <w:i w:val="0"/>
-        </w:rPr>
-        <w:t>Amdocs states that any action taken by an agent is "captured and updated across all relevant billing, CRM, operations, and product databases to ensure a real-time, single source of information" [A].</w:t>
-      </w:r>
-    </w:p>
-    <w:p>
-      <w:pPr>
-        <w:pStyle w:val="Heading2"/>
-      </w:pPr>
-      <w:r>
-        <w:t>4.8 When a product changes after launch</w:t>
-      </w:r>
-    </w:p>
-    <w:p>
-      <w:pPr>
-        <w:spacing w:after="60"/>
-        <w:ind w:left="454" w:hanging="340"/>
-      </w:pPr>
-      <w:r>
-        <w:rPr>
-          <w:b/>
-          <w:color w:val="0C294B"/>
-        </w:rPr>
-        <w:t xml:space="preserve">1.  </w:t>
-      </w:r>
-      <w:r>
-        <w:t>The Product Manager creates a new version in CatalogONE (Stage 7) and takes it through approval and test.</w:t>
-      </w:r>
-    </w:p>
-    <w:p>
-      <w:pPr>
-        <w:spacing w:after="60"/>
-        <w:ind w:left="454" w:hanging="340"/>
-      </w:pPr>
-      <w:r>
-        <w:rPr>
-          <w:b/>
-          <w:color w:val="0C294B"/>
-        </w:rPr>
-        <w:t xml:space="preserve">2.  </w:t>
-      </w:r>
-      <w:r>
-        <w:t>Auto-release / Kafka / TMF620 events push the new version to Dynamics [A][P][S].</w:t>
-      </w:r>
-    </w:p>
-    <w:p>
-      <w:pPr>
-        <w:spacing w:after="60"/>
-        <w:ind w:left="454" w:hanging="340"/>
-      </w:pPr>
-      <w:r>
-        <w:rPr>
-          <w:b/>
-          <w:color w:val="0C294B"/>
-        </w:rPr>
-        <w:t xml:space="preserve">3.  </w:t>
-      </w:r>
-      <w:r>
-        <w:t>New quotes and orders in Dynamics use the new version. Existing customers keep the version they bought, because each order recorded the offering version [S].</w:t>
-      </w:r>
-    </w:p>
-    <w:p>
-      <w:pPr>
-        <w:spacing w:after="60"/>
-        <w:ind w:left="454" w:hanging="340"/>
-      </w:pPr>
-      <w:r>
-        <w:rPr>
-          <w:b/>
-          <w:color w:val="0C294B"/>
-        </w:rPr>
-        <w:t xml:space="preserve">4.  </w:t>
-      </w:r>
-      <w:r>
-        <w:t>When the old version reaches its end-of-sale date, it is Retired in the catalog and retired in Dynamics so it disappears from sales screens [S][M].</w:t>
-      </w:r>
-    </w:p>
-    <w:p>
-      <w:pPr>
-        <w:pStyle w:val="Heading2"/>
-      </w:pPr>
-      <w:r>
-        <w:t>4.9 Why this matches an operator that already runs Dynamics</w:t>
-      </w:r>
-    </w:p>
-    <w:p>
-      <w:r>
-        <w:rPr>
-          <w:i w:val="0"/>
-        </w:rPr>
-        <w:t>CatalogONE is documented as requiring "no system or catalog replacements" and as able to sit on top of existing catalogs and BSS [A]. The CRM in the joint Amdocs–Microsoft stack is Dynamics 365, not a second CRM [A]. For an enterprise operator whose order management and billing already sit on Dynamics, the catalog / PLM is the missing upstream system; Dynamics stays the place sales works.</w:t>
+        <w:t>CatalogONE is documented as requiring "no system or catalog replacements" and as able to sit on top of existing catalogs and BSS [A]. That supports keeping Dynamics. It does not, by itself, prove a ready-made CatalogONE-to-Dynamics feed.</w:t>
       </w:r>
     </w:p>
     <w:p>
@@ -7878,6 +7458,9 @@
             <w:tcW w:type="dxa" w:w="1928"/>
           </w:tcPr>
           <w:p>
+            <w:pPr>
+              <w:keepNext/>
+            </w:pPr>
             <w:r/>
             <w:r>
               <w:rPr>
@@ -7893,6 +7476,9 @@
             <w:tcW w:type="dxa" w:w="2494"/>
           </w:tcPr>
           <w:p>
+            <w:pPr>
+              <w:keepNext/>
+            </w:pPr>
             <w:r/>
             <w:r>
               <w:rPr>
@@ -7907,6 +7493,9 @@
             <w:tcW w:type="dxa" w:w="2948"/>
           </w:tcPr>
           <w:p>
+            <w:pPr>
+              <w:keepNext/>
+            </w:pPr>
             <w:r/>
             <w:r>
               <w:rPr>
@@ -7921,12 +7510,74 @@
             <w:tcW w:type="dxa" w:w="2041"/>
           </w:tcPr>
           <w:p>
+            <w:pPr>
+              <w:keepNext/>
+            </w:pPr>
             <w:r/>
             <w:r>
               <w:rPr>
                 <w:sz w:val="19"/>
               </w:rPr>
               <w:t>Operator quote in trade press, 2015</w:t>
+            </w:r>
+          </w:p>
+        </w:tc>
+      </w:tr>
+      <w:tr>
+        <w:tc>
+          <w:tcPr>
+            <w:tcW w:type="dxa" w:w="1928"/>
+          </w:tcPr>
+          <w:p>
+            <w:r/>
+            <w:r>
+              <w:rPr>
+                <w:b/>
+                <w:sz w:val="19"/>
+              </w:rPr>
+              <w:t>PLDT (Philippines)</w:t>
+            </w:r>
+          </w:p>
+        </w:tc>
+        <w:tc>
+          <w:tcPr>
+            <w:tcW w:type="dxa" w:w="2494"/>
+          </w:tcPr>
+          <w:p>
+            <w:r/>
+            <w:r>
+              <w:rPr>
+                <w:sz w:val="19"/>
+              </w:rPr>
+              <w:t>Amdocs–Microsoft Customer Engagement Platform: Unified Case Management. Agents use Dynamics 365. Not a CatalogONE catalog-publish case</w:t>
+            </w:r>
+          </w:p>
+        </w:tc>
+        <w:tc>
+          <w:tcPr>
+            <w:tcW w:type="dxa" w:w="2948"/>
+          </w:tcPr>
+          <w:p>
+            <w:r/>
+            <w:r>
+              <w:rPr>
+                <w:sz w:val="19"/>
+              </w:rPr>
+              <w:t>Six weeks after go-live: 48% faster L1 resolution; +27 NPS on targeted use cases. Press names Dynamics 365 and Copilot as the agent workspace</w:t>
+            </w:r>
+          </w:p>
+        </w:tc>
+        <w:tc>
+          <w:tcPr>
+            <w:tcW w:type="dxa" w:w="2041"/>
+          </w:tcPr>
+          <w:p>
+            <w:r/>
+            <w:r>
+              <w:rPr>
+                <w:sz w:val="19"/>
+              </w:rPr>
+              <w:t>Amdocs go-live, 7 May 2025 [A]; IDC case study, June 2026 [I]</w:t>
             </w:r>
           </w:p>
         </w:tc>
@@ -8238,7 +7889,7 @@
         <w:t xml:space="preserve">11.  </w:t>
       </w:r>
       <w:r>
-        <w:t>TM Forum, Sprint / T-Mobile cloud-native case study (CatalogONE): https://www.tmforum.org/wp-content/uploads/2021/02/TM-Forum-Excellence-Awards-Case-Study-Cloud_Sprint.pdf</w:t>
+        <w:t>Amdocs, press release, PLDT Goes Live with the Amdocs Customer Engagement Platform (7 May 2025): https://www.amdocs.com/press-release/pldt-goes-live-amdocs-customer-engagement-platform-redefine-customer</w:t>
       </w:r>
     </w:p>
     <w:p>
@@ -8254,7 +7905,7 @@
         <w:t xml:space="preserve">12.  </w:t>
       </w:r>
       <w:r>
-        <w:t>Amdocs, KT implements CatalogONE (10 Nov 2020): https://www.globenewswire.com/news-release/2020/11/10/2124219/0/en/KT-Successfully-Implements-Amdocs-CatalogONE-Cloud-Native-Solution-to-Accelerate-Introduction-of-New-5G-Offerings.html</w:t>
+        <w:t>IDC (Christopher Silberberg and Ahmad Latif Ali), How PLDT Delivered Customer Experience Gains in Just Six Weeks — Unified Case Management on the Amdocs Customer Engagement Platform (June 2026): https://www.amdocs.com/sites/default/files/2026-06/Amdocs-PLDT-idc-case-study.pdf</w:t>
       </w:r>
     </w:p>
     <w:p>
@@ -8270,7 +7921,7 @@
         <w:t xml:space="preserve">13.  </w:t>
       </w:r>
       <w:r>
-        <w:t>TM Forum, Open API conformance list (Amdocs TMF620 and related APIs): https://www.tmforum.org/conformance-certification/open-api-conformance/</w:t>
+        <w:t>Amdocs, case-study landing page for the same IDC paper: https://www.amdocs.com/insights/case-study/how-pldt-delivered-customer-experience-gains-just-six-weeks</w:t>
       </w:r>
     </w:p>
     <w:p>
@@ -8286,7 +7937,7 @@
         <w:t xml:space="preserve">14.  </w:t>
       </w:r>
       <w:r>
-        <w:t>TM Forum, TMF620 Product Catalog Management API: https://www.tmforum.org/open-digital-architecture/open-apis/product-catalog-management-api-TMF620/v5.0</w:t>
+        <w:t>TM Forum, Sprint / T-Mobile cloud-native case study (CatalogONE): https://www.tmforum.org/wp-content/uploads/2021/02/TM-Forum-Excellence-Awards-Case-Study-Cloud_Sprint.pdf</w:t>
       </w:r>
     </w:p>
     <w:p>
@@ -8302,7 +7953,7 @@
         <w:t xml:space="preserve">15.  </w:t>
       </w:r>
       <w:r>
-        <w:t>TM Forum, TMF679 Product Offering Qualification API: https://www.tmforum.org/open-digital-architecture/open-apis/product-offering-qualification-api-TMF679</w:t>
+        <w:t>Amdocs, KT implements CatalogONE (10 Nov 2020): https://www.globenewswire.com/news-release/2020/11/10/2124219/0/en/KT-Successfully-Implements-Amdocs-CatalogONE-Cloud-Native-Solution-to-Accelerate-Introduction-of-New-5G-Offerings.html</w:t>
       </w:r>
     </w:p>
     <w:p>
@@ -8318,6 +7969,54 @@
         <w:t xml:space="preserve">16.  </w:t>
       </w:r>
       <w:r>
+        <w:t>TM Forum, Open API conformance list (Amdocs TMF620 and related APIs): https://www.tmforum.org/conformance-certification/open-api-conformance/</w:t>
+      </w:r>
+    </w:p>
+    <w:p>
+      <w:pPr>
+        <w:spacing w:after="60"/>
+        <w:ind w:left="454" w:hanging="340"/>
+      </w:pPr>
+      <w:r>
+        <w:rPr>
+          <w:b/>
+          <w:color w:val="0C294B"/>
+        </w:rPr>
+        <w:t xml:space="preserve">17.  </w:t>
+      </w:r>
+      <w:r>
+        <w:t>TM Forum, TMF620 Product Catalog Management API: https://www.tmforum.org/open-digital-architecture/open-apis/product-catalog-management-api-TMF620/v5.0</w:t>
+      </w:r>
+    </w:p>
+    <w:p>
+      <w:pPr>
+        <w:spacing w:after="60"/>
+        <w:ind w:left="454" w:hanging="340"/>
+      </w:pPr>
+      <w:r>
+        <w:rPr>
+          <w:b/>
+          <w:color w:val="0C294B"/>
+        </w:rPr>
+        <w:t xml:space="preserve">18.  </w:t>
+      </w:r>
+      <w:r>
+        <w:t>TM Forum, TMF679 Product Offering Qualification API: https://www.tmforum.org/open-digital-architecture/open-apis/product-offering-qualification-api-TMF679</w:t>
+      </w:r>
+    </w:p>
+    <w:p>
+      <w:pPr>
+        <w:spacing w:after="60"/>
+        <w:ind w:left="454" w:hanging="340"/>
+      </w:pPr>
+      <w:r>
+        <w:rPr>
+          <w:b/>
+          <w:color w:val="0C294B"/>
+        </w:rPr>
+        <w:t xml:space="preserve">19.  </w:t>
+      </w:r>
+      <w:r>
         <w:t>Microsoft Learn, Product catalog tables (Dynamics 365 Sales): https://learn.microsoft.com/en-us/dynamics365/sales/developer/product-catalog-entities</w:t>
       </w:r>
     </w:p>
@@ -8331,7 +8030,7 @@
           <w:b/>
           <w:color w:val="0C294B"/>
         </w:rPr>
-        <w:t xml:space="preserve">17.  </w:t>
+        <w:t xml:space="preserve">20.  </w:t>
       </w:r>
       <w:r>
         <w:t>Microsoft Learn, Publish a product or bundle (Dynamics 365 Sales): https://learn.microsoft.com/en-us/dynamics365/sales/publish-product-bundle-make-available-selling</w:t>

</xml_diff>

<commit_message>
Spell out CEP: Amdocs–Microsoft Customer Engagement Platform
Manager-facing wording: CEP is the packaged telecom CRM Amdocs and
Microsoft sell together, not a CatalogONE plug-in for existing Dynamics.

Co-authored-by: abdelrahman Hamdy <abdoe317111@gmail.com>
</commit_message>
<xml_diff>
--- a/plc_study/PLC_CatalogONE_Study.docx
+++ b/plc_study/PLC_CatalogONE_Study.docx
@@ -29,7 +29,7 @@
           <w:i w:val="0"/>
           <w:color w:val="5F5A6B"/>
         </w:rPr>
-        <w:t>System studied: Amdocs CatalogONE, a standalone telecom product catalog and Product Lifecycle Management (PLM) platform. It is BSS-agnostic: it owns the catalog, not the CRM. Amdocs documents that CatalogONE publishes to consuming applications and to "the customer's CRM". The Amdocs–Microsoft Customer Engagement Platform is the product that puts an Amdocs Catalog next to Dynamics 365. Amdocs does not publish a CatalogONE-branded connector named Dynamics 365.</w:t>
+        <w:t>System studied: Amdocs CatalogONE, a standalone telecom product catalog and Product Lifecycle Management (PLM) platform. It is BSS-agnostic: it owns the catalog, not the CRM. Amdocs documents that CatalogONE publishes to consuming applications and to "the customer's CRM". The Amdocs–Microsoft Customer Engagement Platform (CEP) is the product that puts an Amdocs Catalog next to Dynamics 365. Amdocs does not publish a CatalogONE-branded connector named Dynamics 365.</w:t>
       </w:r>
     </w:p>
     <w:p>
@@ -38,7 +38,7 @@
           <w:i w:val="0"/>
           <w:color w:val="5F5A6B"/>
         </w:rPr>
-        <w:t>Prepared by: [Your name]    |    Version: Draft 3 for review    |    October 2026</w:t>
+        <w:t>Prepared by: [Your name]    |    Version: Draft 4 for review    |    October 2026</w:t>
       </w:r>
     </w:p>
     <w:tbl>
@@ -6386,7 +6386,15 @@
         <w:rPr>
           <w:i w:val="0"/>
         </w:rPr>
-        <w:t>Separately, Amdocs and Microsoft sell the Customer Engagement Platform. That product "leverages … a unified Catalog, CPQ, Commerce and Order Management, and adds Microsoft's Dynamics 365 modules focused on sales, marketing, and customer service" [A]. AppSource lists it as a Dynamics 365 offering, with "Unified Catalog Serving the Entire Platform" [A].</w:t>
+        <w:t>CEP is the Amdocs–Microsoft Customer Engagement Platform. It is not CatalogONE. It is a packaged telecom CRM that Amdocs and Microsoft sell together: Amdocs catalog, CPQ, commerce and order management, plus Microsoft Dynamics 365 Sales, Marketing and Customer Service, on Azure [A]. "Buy CEP" means buy that whole platform — not a CatalogONE plug-in for an existing Dynamics org.</w:t>
+      </w:r>
+    </w:p>
+    <w:p>
+      <w:r>
+        <w:rPr>
+          <w:i w:val="0"/>
+        </w:rPr>
+        <w:t>Amdocs' wording: the platform "leverages … a unified Catalog, CPQ, Commerce and Order Management, and adds Microsoft's Dynamics 365 modules focused on sales, marketing, and customer service" [A]. AppSource lists it as a Dynamics 365 offering, with "Unified Catalog Serving the Entire Platform" [A].</w:t>
       </w:r>
     </w:p>
     <w:p>
@@ -7041,7 +7049,7 @@
                 <w:b/>
                 <w:sz w:val="19"/>
               </w:rPr>
-              <w:t>Buy / adopt CEP</w:t>
+              <w:t>Buy the Customer Engagement Platform (CEP)</w:t>
             </w:r>
           </w:p>
         </w:tc>
@@ -7058,7 +7066,7 @@
               <w:rPr>
                 <w:sz w:val="19"/>
               </w:rPr>
-              <w:t>Amdocs Catalog + Dynamics 365 as one pre-integrated platform. PLDT is live on CEP customer service (Unified Case Management)</w:t>
+              <w:t>The Amdocs–Microsoft packaged CRM: Amdocs catalog + Dynamics 365 as one platform. PLDT is live on CEP customer service (Unified Case Management)</w:t>
             </w:r>
           </w:p>
         </w:tc>

</xml_diff>